<commit_message>
Actualizacion: soporte para DUI en letras, fallbacks de identidad y multidelitos
</commit_message>
<xml_diff>
--- a/01_ACTA_DE_REMISION_PLANTILLA.docx
+++ b/01_ACTA_DE_REMISION_PLANTILLA.docx
@@ -4,21 +4,80 @@
   <w:body>
     <w:p>
       <w:pPr>
-        <w:rPr>
-          <w:rFonts w:ascii="Arial" w:hAnsi="Arial"/>
-          <w:b/>
-          <w:sz w:val="24"/>
+        <w:jc w:val="center"/>
+        <w:rPr>
+          <w:rFonts w:ascii="Arial" w:hAnsi="Arial"/>
+          <w:b/>
+          <w:sz w:val="24"/>
+          <w:szCs w:val="24"/>
           <w:lang w:val="es-SV"/>
         </w:rPr>
       </w:pPr>
-      <w:r>
-        <w:rPr>
-          <w:rFonts w:ascii="Arial" w:hAnsi="Arial"/>
-          <w:b/>
-          <w:sz w:val="24"/>
-          <w:lang w:val="es-SV"/>
-        </w:rPr>
-        <w:t>ACTA DE REMISION</w:t>
+      <w:proofErr w:type="gramStart"/>
+      <w:r>
+        <w:rPr>
+          <w:rFonts w:ascii="Arial" w:hAnsi="Arial"/>
+          <w:b/>
+          <w:sz w:val="24"/>
+          <w:szCs w:val="24"/>
+          <w:lang w:val="es-SV"/>
+        </w:rPr>
+        <w:t xml:space="preserve">{{ </w:t>
+      </w:r>
+      <w:proofErr w:type="spellStart"/>
+      <w:r>
+        <w:rPr>
+          <w:rFonts w:ascii="Arial" w:hAnsi="Arial"/>
+          <w:b/>
+          <w:sz w:val="24"/>
+          <w:szCs w:val="24"/>
+          <w:lang w:val="es-SV"/>
+        </w:rPr>
+        <w:t>codigo</w:t>
+      </w:r>
+      <w:proofErr w:type="gramEnd"/>
+      <w:r>
+        <w:rPr>
+          <w:rFonts w:ascii="Arial" w:hAnsi="Arial"/>
+          <w:b/>
+          <w:sz w:val="24"/>
+          <w:szCs w:val="24"/>
+          <w:lang w:val="es-SV"/>
+        </w:rPr>
+        <w:t>_</w:t>
+      </w:r>
+      <w:proofErr w:type="gramStart"/>
+      <w:r>
+        <w:rPr>
+          <w:rFonts w:ascii="Arial" w:hAnsi="Arial"/>
+          <w:b/>
+          <w:sz w:val="24"/>
+          <w:szCs w:val="24"/>
+          <w:lang w:val="es-SV"/>
+        </w:rPr>
+        <w:t>expediente</w:t>
+      </w:r>
+      <w:proofErr w:type="spellEnd"/>
+      <w:r>
+        <w:rPr>
+          <w:rFonts w:ascii="Arial" w:hAnsi="Arial"/>
+          <w:b/>
+          <w:sz w:val="24"/>
+          <w:szCs w:val="24"/>
+          <w:lang w:val="es-SV"/>
+        </w:rPr>
+        <w:t xml:space="preserve"> }</w:t>
+      </w:r>
+      <w:proofErr w:type="gramEnd"/>
+      <w:r>
+        <w:rPr>
+          <w:rFonts w:ascii="Arial" w:hAnsi="Arial"/>
+          <w:b/>
+          <w:sz w:val="24"/>
+          <w:szCs w:val="24"/>
+          <w:lang w:val="es-SV"/>
+        </w:rPr>
+        <w:t>}</w:t>
       </w:r>
     </w:p>
     <w:p>
@@ -27,6 +86,8 @@
         <w:rPr>
           <w:rFonts w:ascii="Arial" w:hAnsi="Arial"/>
           <w:b/>
+          <w:sz w:val="24"/>
+          <w:szCs w:val="24"/>
           <w:lang w:val="es-SV"/>
         </w:rPr>
       </w:pPr>
@@ -34,6 +95,8 @@
         <w:rPr>
           <w:rFonts w:ascii="Arial" w:hAnsi="Arial"/>
           <w:b/>
+          <w:sz w:val="24"/>
+          <w:szCs w:val="24"/>
           <w:lang w:val="es-SV"/>
         </w:rPr>
         <w:t xml:space="preserve">EN </w:t>
@@ -43,6 +106,8 @@
         <w:rPr>
           <w:rFonts w:ascii="Arial" w:hAnsi="Arial"/>
           <w:b/>
+          <w:sz w:val="24"/>
+          <w:szCs w:val="24"/>
           <w:lang w:val="es-SV"/>
         </w:rPr>
         <w:t xml:space="preserve">{{ </w:t>
@@ -52,6 +117,8 @@
         <w:rPr>
           <w:rFonts w:ascii="Arial" w:hAnsi="Arial"/>
           <w:b/>
+          <w:sz w:val="24"/>
+          <w:szCs w:val="24"/>
           <w:lang w:val="es-SV"/>
         </w:rPr>
         <w:t>lugar</w:t>
@@ -61,6 +128,8 @@
         <w:rPr>
           <w:rFonts w:ascii="Arial" w:hAnsi="Arial"/>
           <w:b/>
+          <w:sz w:val="24"/>
+          <w:szCs w:val="24"/>
           <w:lang w:val="es-SV"/>
         </w:rPr>
         <w:t>_</w:t>
@@ -70,6 +139,8 @@
         <w:rPr>
           <w:rFonts w:ascii="Arial" w:hAnsi="Arial"/>
           <w:b/>
+          <w:sz w:val="24"/>
+          <w:szCs w:val="24"/>
           <w:lang w:val="es-SV"/>
         </w:rPr>
         <w:t>acta</w:t>
@@ -79,6 +150,8 @@
         <w:rPr>
           <w:rFonts w:ascii="Arial" w:hAnsi="Arial"/>
           <w:b/>
+          <w:sz w:val="24"/>
+          <w:szCs w:val="24"/>
           <w:lang w:val="es-SV"/>
         </w:rPr>
         <w:t xml:space="preserve"> }</w:t>
@@ -88,6 +161,8 @@
         <w:rPr>
           <w:rFonts w:ascii="Arial" w:hAnsi="Arial"/>
           <w:b/>
+          <w:sz w:val="24"/>
+          <w:szCs w:val="24"/>
           <w:lang w:val="es-SV"/>
         </w:rPr>
         <w:t xml:space="preserve">} A LAS </w:t>
@@ -97,6 +172,8 @@
         <w:rPr>
           <w:rFonts w:ascii="Arial" w:hAnsi="Arial"/>
           <w:b/>
+          <w:sz w:val="24"/>
+          <w:szCs w:val="24"/>
           <w:lang w:val="es-SV"/>
         </w:rPr>
         <w:t xml:space="preserve">{{ </w:t>
@@ -106,6 +183,8 @@
         <w:rPr>
           <w:rFonts w:ascii="Arial" w:hAnsi="Arial"/>
           <w:b/>
+          <w:sz w:val="24"/>
+          <w:szCs w:val="24"/>
           <w:lang w:val="es-SV"/>
         </w:rPr>
         <w:t>hora</w:t>
@@ -115,6 +194,8 @@
         <w:rPr>
           <w:rFonts w:ascii="Arial" w:hAnsi="Arial"/>
           <w:b/>
+          <w:sz w:val="24"/>
+          <w:szCs w:val="24"/>
           <w:lang w:val="es-SV"/>
         </w:rPr>
         <w:t>_acta_</w:t>
@@ -124,6 +205,8 @@
         <w:rPr>
           <w:rFonts w:ascii="Arial" w:hAnsi="Arial"/>
           <w:b/>
+          <w:sz w:val="24"/>
+          <w:szCs w:val="24"/>
           <w:lang w:val="es-SV"/>
         </w:rPr>
         <w:t>texto</w:t>
@@ -133,6 +216,8 @@
         <w:rPr>
           <w:rFonts w:ascii="Arial" w:hAnsi="Arial"/>
           <w:b/>
+          <w:sz w:val="24"/>
+          <w:szCs w:val="24"/>
           <w:lang w:val="es-SV"/>
         </w:rPr>
         <w:t xml:space="preserve"> }</w:t>
@@ -142,6 +227,8 @@
         <w:rPr>
           <w:rFonts w:ascii="Arial" w:hAnsi="Arial"/>
           <w:b/>
+          <w:sz w:val="24"/>
+          <w:szCs w:val="24"/>
           <w:lang w:val="es-SV"/>
         </w:rPr>
         <w:t xml:space="preserve">} HORAS CON </w:t>
@@ -151,6 +238,8 @@
         <w:rPr>
           <w:rFonts w:ascii="Arial" w:hAnsi="Arial"/>
           <w:b/>
+          <w:sz w:val="24"/>
+          <w:szCs w:val="24"/>
           <w:lang w:val="es-SV"/>
         </w:rPr>
         <w:t xml:space="preserve">{{ </w:t>
@@ -160,6 +249,8 @@
         <w:rPr>
           <w:rFonts w:ascii="Arial" w:hAnsi="Arial"/>
           <w:b/>
+          <w:sz w:val="24"/>
+          <w:szCs w:val="24"/>
           <w:lang w:val="es-SV"/>
         </w:rPr>
         <w:t>minutos</w:t>
@@ -169,6 +260,8 @@
         <w:rPr>
           <w:rFonts w:ascii="Arial" w:hAnsi="Arial"/>
           <w:b/>
+          <w:sz w:val="24"/>
+          <w:szCs w:val="24"/>
           <w:lang w:val="es-SV"/>
         </w:rPr>
         <w:t>_acta_</w:t>
@@ -178,6 +271,8 @@
         <w:rPr>
           <w:rFonts w:ascii="Arial" w:hAnsi="Arial"/>
           <w:b/>
+          <w:sz w:val="24"/>
+          <w:szCs w:val="24"/>
           <w:lang w:val="es-SV"/>
         </w:rPr>
         <w:t>texto</w:t>
@@ -187,6 +282,8 @@
         <w:rPr>
           <w:rFonts w:ascii="Arial" w:hAnsi="Arial"/>
           <w:b/>
+          <w:sz w:val="24"/>
+          <w:szCs w:val="24"/>
           <w:lang w:val="es-SV"/>
         </w:rPr>
         <w:t xml:space="preserve"> }</w:t>
@@ -196,6 +293,8 @@
         <w:rPr>
           <w:rFonts w:ascii="Arial" w:hAnsi="Arial"/>
           <w:b/>
+          <w:sz w:val="24"/>
+          <w:szCs w:val="24"/>
           <w:lang w:val="es-SV"/>
         </w:rPr>
         <w:t xml:space="preserve">} MINUTOS DEL DIA </w:t>
@@ -205,6 +304,8 @@
         <w:rPr>
           <w:rFonts w:ascii="Arial" w:hAnsi="Arial"/>
           <w:b/>
+          <w:sz w:val="24"/>
+          <w:szCs w:val="24"/>
           <w:lang w:val="es-SV"/>
         </w:rPr>
         <w:t xml:space="preserve">{{ </w:t>
@@ -214,6 +315,8 @@
         <w:rPr>
           <w:rFonts w:ascii="Arial" w:hAnsi="Arial"/>
           <w:b/>
+          <w:sz w:val="24"/>
+          <w:szCs w:val="24"/>
           <w:lang w:val="es-SV"/>
         </w:rPr>
         <w:t>dia</w:t>
@@ -223,6 +326,8 @@
         <w:rPr>
           <w:rFonts w:ascii="Arial" w:hAnsi="Arial"/>
           <w:b/>
+          <w:sz w:val="24"/>
+          <w:szCs w:val="24"/>
           <w:lang w:val="es-SV"/>
         </w:rPr>
         <w:t>_acta_</w:t>
@@ -232,6 +337,8 @@
         <w:rPr>
           <w:rFonts w:ascii="Arial" w:hAnsi="Arial"/>
           <w:b/>
+          <w:sz w:val="24"/>
+          <w:szCs w:val="24"/>
           <w:lang w:val="es-SV"/>
         </w:rPr>
         <w:t>texto</w:t>
@@ -241,6 +348,8 @@
         <w:rPr>
           <w:rFonts w:ascii="Arial" w:hAnsi="Arial"/>
           <w:b/>
+          <w:sz w:val="24"/>
+          <w:szCs w:val="24"/>
           <w:lang w:val="es-SV"/>
         </w:rPr>
         <w:t xml:space="preserve"> }</w:t>
@@ -250,6 +359,8 @@
         <w:rPr>
           <w:rFonts w:ascii="Arial" w:hAnsi="Arial"/>
           <w:b/>
+          <w:sz w:val="24"/>
+          <w:szCs w:val="24"/>
           <w:lang w:val="es-SV"/>
         </w:rPr>
         <w:t xml:space="preserve">} DE </w:t>
@@ -259,6 +370,8 @@
         <w:rPr>
           <w:rFonts w:ascii="Arial" w:hAnsi="Arial"/>
           <w:b/>
+          <w:sz w:val="24"/>
+          <w:szCs w:val="24"/>
           <w:lang w:val="es-SV"/>
         </w:rPr>
         <w:t xml:space="preserve">{{ </w:t>
@@ -268,6 +381,8 @@
         <w:rPr>
           <w:rFonts w:ascii="Arial" w:hAnsi="Arial"/>
           <w:b/>
+          <w:sz w:val="24"/>
+          <w:szCs w:val="24"/>
           <w:lang w:val="es-SV"/>
         </w:rPr>
         <w:t>mes</w:t>
@@ -277,6 +392,8 @@
         <w:rPr>
           <w:rFonts w:ascii="Arial" w:hAnsi="Arial"/>
           <w:b/>
+          <w:sz w:val="24"/>
+          <w:szCs w:val="24"/>
           <w:lang w:val="es-SV"/>
         </w:rPr>
         <w:t>_acta_</w:t>
@@ -286,6 +403,8 @@
         <w:rPr>
           <w:rFonts w:ascii="Arial" w:hAnsi="Arial"/>
           <w:b/>
+          <w:sz w:val="24"/>
+          <w:szCs w:val="24"/>
           <w:lang w:val="es-SV"/>
         </w:rPr>
         <w:t>texto</w:t>
@@ -295,6 +414,8 @@
         <w:rPr>
           <w:rFonts w:ascii="Arial" w:hAnsi="Arial"/>
           <w:b/>
+          <w:sz w:val="24"/>
+          <w:szCs w:val="24"/>
           <w:lang w:val="es-SV"/>
         </w:rPr>
         <w:t xml:space="preserve"> }</w:t>
@@ -304,6 +425,8 @@
         <w:rPr>
           <w:rFonts w:ascii="Arial" w:hAnsi="Arial"/>
           <w:b/>
+          <w:sz w:val="24"/>
+          <w:szCs w:val="24"/>
           <w:lang w:val="es-SV"/>
         </w:rPr>
         <w:t xml:space="preserve">} DEL AÑO </w:t>
@@ -313,6 +436,8 @@
         <w:rPr>
           <w:rFonts w:ascii="Arial" w:hAnsi="Arial"/>
           <w:b/>
+          <w:sz w:val="24"/>
+          <w:szCs w:val="24"/>
           <w:lang w:val="es-SV"/>
         </w:rPr>
         <w:t xml:space="preserve">{{ </w:t>
@@ -322,6 +447,8 @@
         <w:rPr>
           <w:rFonts w:ascii="Arial" w:hAnsi="Arial"/>
           <w:b/>
+          <w:sz w:val="24"/>
+          <w:szCs w:val="24"/>
           <w:lang w:val="es-SV"/>
         </w:rPr>
         <w:t>anio</w:t>
@@ -331,6 +458,8 @@
         <w:rPr>
           <w:rFonts w:ascii="Arial" w:hAnsi="Arial"/>
           <w:b/>
+          <w:sz w:val="24"/>
+          <w:szCs w:val="24"/>
           <w:lang w:val="es-SV"/>
         </w:rPr>
         <w:t>_acta_</w:t>
@@ -340,6 +469,8 @@
         <w:rPr>
           <w:rFonts w:ascii="Arial" w:hAnsi="Arial"/>
           <w:b/>
+          <w:sz w:val="24"/>
+          <w:szCs w:val="24"/>
           <w:lang w:val="es-SV"/>
         </w:rPr>
         <w:t>texto</w:t>
@@ -349,6 +480,8 @@
         <w:rPr>
           <w:rFonts w:ascii="Arial" w:hAnsi="Arial"/>
           <w:b/>
+          <w:sz w:val="24"/>
+          <w:szCs w:val="24"/>
           <w:lang w:val="es-SV"/>
         </w:rPr>
         <w:t xml:space="preserve"> }</w:t>
@@ -358,6 +491,8 @@
         <w:rPr>
           <w:rFonts w:ascii="Arial" w:hAnsi="Arial"/>
           <w:b/>
+          <w:sz w:val="24"/>
+          <w:szCs w:val="24"/>
           <w:lang w:val="es-SV"/>
         </w:rPr>
         <w:t xml:space="preserve">}. </w:t>
@@ -366,6 +501,8 @@
         <w:rPr>
           <w:rFonts w:ascii="Arial" w:hAnsi="Arial"/>
           <w:b/>
+          <w:sz w:val="24"/>
+          <w:szCs w:val="24"/>
           <w:lang w:val="es-SV"/>
         </w:rPr>
         <w:t xml:space="preserve">Los suscritos </w:t>
@@ -375,6 +512,8 @@
         <w:rPr>
           <w:rFonts w:ascii="Arial" w:hAnsi="Arial"/>
           <w:b/>
+          <w:sz w:val="24"/>
+          <w:szCs w:val="24"/>
           <w:lang w:val="es-SV"/>
         </w:rPr>
         <w:t>{{ cargo</w:t>
@@ -384,6 +523,8 @@
         <w:rPr>
           <w:rFonts w:ascii="Arial" w:hAnsi="Arial"/>
           <w:b/>
+          <w:sz w:val="24"/>
+          <w:szCs w:val="24"/>
           <w:lang w:val="es-SV"/>
         </w:rPr>
         <w:t>_nombre_agente_</w:t>
@@ -393,6 +534,8 @@
         <w:rPr>
           <w:rFonts w:ascii="Arial" w:hAnsi="Arial"/>
           <w:b/>
+          <w:sz w:val="24"/>
+          <w:szCs w:val="24"/>
           <w:lang w:val="es-SV"/>
         </w:rPr>
         <w:t>1 }</w:t>
@@ -402,6 +545,8 @@
         <w:rPr>
           <w:rFonts w:ascii="Arial" w:hAnsi="Arial"/>
           <w:b/>
+          <w:sz w:val="24"/>
+          <w:szCs w:val="24"/>
           <w:lang w:val="es-SV"/>
         </w:rPr>
         <w:t xml:space="preserve">} con orden numérico institucional </w:t>
@@ -411,6 +556,8 @@
         <w:rPr>
           <w:rFonts w:ascii="Arial" w:hAnsi="Arial"/>
           <w:b/>
+          <w:sz w:val="24"/>
+          <w:szCs w:val="24"/>
           <w:lang w:val="es-SV"/>
         </w:rPr>
         <w:t>{{ oni</w:t>
@@ -420,6 +567,8 @@
         <w:rPr>
           <w:rFonts w:ascii="Arial" w:hAnsi="Arial"/>
           <w:b/>
+          <w:sz w:val="24"/>
+          <w:szCs w:val="24"/>
           <w:lang w:val="es-SV"/>
         </w:rPr>
         <w:t>_agente_</w:t>
@@ -429,6 +578,8 @@
         <w:rPr>
           <w:rFonts w:ascii="Arial" w:hAnsi="Arial"/>
           <w:b/>
+          <w:sz w:val="24"/>
+          <w:szCs w:val="24"/>
           <w:lang w:val="es-SV"/>
         </w:rPr>
         <w:t>1 }</w:t>
@@ -438,6 +589,8 @@
         <w:rPr>
           <w:rFonts w:ascii="Arial" w:hAnsi="Arial"/>
           <w:b/>
+          <w:sz w:val="24"/>
+          <w:szCs w:val="24"/>
           <w:lang w:val="es-SV"/>
         </w:rPr>
         <w:t xml:space="preserve">} y el </w:t>
@@ -447,6 +600,8 @@
         <w:rPr>
           <w:rFonts w:ascii="Arial" w:hAnsi="Arial"/>
           <w:b/>
+          <w:sz w:val="24"/>
+          <w:szCs w:val="24"/>
           <w:lang w:val="es-SV"/>
         </w:rPr>
         <w:t>{{ cargo</w:t>
@@ -456,6 +611,8 @@
         <w:rPr>
           <w:rFonts w:ascii="Arial" w:hAnsi="Arial"/>
           <w:b/>
+          <w:sz w:val="24"/>
+          <w:szCs w:val="24"/>
           <w:lang w:val="es-SV"/>
         </w:rPr>
         <w:t>_nombre_agente_</w:t>
@@ -465,6 +622,8 @@
         <w:rPr>
           <w:rFonts w:ascii="Arial" w:hAnsi="Arial"/>
           <w:b/>
+          <w:sz w:val="24"/>
+          <w:szCs w:val="24"/>
           <w:lang w:val="es-SV"/>
         </w:rPr>
         <w:t>2 }</w:t>
@@ -474,6 +633,8 @@
         <w:rPr>
           <w:rFonts w:ascii="Arial" w:hAnsi="Arial"/>
           <w:b/>
+          <w:sz w:val="24"/>
+          <w:szCs w:val="24"/>
           <w:lang w:val="es-SV"/>
         </w:rPr>
         <w:t xml:space="preserve">} con orden numérico institucional </w:t>
@@ -483,6 +644,8 @@
         <w:rPr>
           <w:rFonts w:ascii="Arial" w:hAnsi="Arial"/>
           <w:b/>
+          <w:sz w:val="24"/>
+          <w:szCs w:val="24"/>
           <w:lang w:val="es-SV"/>
         </w:rPr>
         <w:t>{{ oni</w:t>
@@ -492,6 +655,8 @@
         <w:rPr>
           <w:rFonts w:ascii="Arial" w:hAnsi="Arial"/>
           <w:b/>
+          <w:sz w:val="24"/>
+          <w:szCs w:val="24"/>
           <w:lang w:val="es-SV"/>
         </w:rPr>
         <w:t>_agente_</w:t>
@@ -501,6 +666,8 @@
         <w:rPr>
           <w:rFonts w:ascii="Arial" w:hAnsi="Arial"/>
           <w:b/>
+          <w:sz w:val="24"/>
+          <w:szCs w:val="24"/>
           <w:lang w:val="es-SV"/>
         </w:rPr>
         <w:t>2 }</w:t>
@@ -510,6 +677,8 @@
         <w:rPr>
           <w:rFonts w:ascii="Arial" w:hAnsi="Arial"/>
           <w:b/>
+          <w:sz w:val="24"/>
+          <w:szCs w:val="24"/>
           <w:lang w:val="es-SV"/>
         </w:rPr>
         <w:t>}</w:t>
@@ -518,6 +687,8 @@
         <w:rPr>
           <w:rFonts w:ascii="Arial" w:hAnsi="Arial"/>
           <w:b/>
+          <w:sz w:val="24"/>
+          <w:szCs w:val="24"/>
           <w:lang w:val="es-SV"/>
         </w:rPr>
         <w:t xml:space="preserve"> dejamos constancia de la APREHENSION en flagrancia de </w:t>
@@ -527,6 +698,8 @@
         <w:rPr>
           <w:rFonts w:ascii="Arial" w:hAnsi="Arial"/>
           <w:b/>
+          <w:sz w:val="24"/>
+          <w:szCs w:val="24"/>
           <w:lang w:val="es-SV"/>
         </w:rPr>
         <w:t xml:space="preserve">{{ </w:t>
@@ -536,6 +709,8 @@
         <w:rPr>
           <w:rFonts w:ascii="Arial" w:hAnsi="Arial"/>
           <w:b/>
+          <w:sz w:val="24"/>
+          <w:szCs w:val="24"/>
           <w:lang w:val="es-SV"/>
         </w:rPr>
         <w:t>bloque</w:t>
@@ -545,6 +720,8 @@
         <w:rPr>
           <w:rFonts w:ascii="Arial" w:hAnsi="Arial"/>
           <w:b/>
+          <w:sz w:val="24"/>
+          <w:szCs w:val="24"/>
           <w:lang w:val="es-SV"/>
         </w:rPr>
         <w:t>_imputados_</w:t>
@@ -554,6 +731,8 @@
         <w:rPr>
           <w:rFonts w:ascii="Arial" w:hAnsi="Arial"/>
           <w:b/>
+          <w:sz w:val="24"/>
+          <w:szCs w:val="24"/>
           <w:lang w:val="es-SV"/>
         </w:rPr>
         <w:t>remision</w:t>
@@ -563,6 +742,8 @@
         <w:rPr>
           <w:rFonts w:ascii="Arial" w:hAnsi="Arial"/>
           <w:b/>
+          <w:sz w:val="24"/>
+          <w:szCs w:val="24"/>
           <w:lang w:val="es-SV"/>
         </w:rPr>
         <w:t xml:space="preserve"> }</w:t>
@@ -572,6 +753,8 @@
         <w:rPr>
           <w:rFonts w:ascii="Arial" w:hAnsi="Arial"/>
           <w:b/>
+          <w:sz w:val="24"/>
+          <w:szCs w:val="24"/>
           <w:lang w:val="es-SV"/>
         </w:rPr>
         <w:t xml:space="preserve">}, </w:t>
@@ -581,6 +764,8 @@
         <w:rPr>
           <w:rFonts w:ascii="Arial" w:hAnsi="Arial"/>
           <w:b/>
+          <w:sz w:val="24"/>
+          <w:szCs w:val="24"/>
           <w:lang w:val="es-SV"/>
         </w:rPr>
         <w:t xml:space="preserve">{{ </w:t>
@@ -590,6 +775,8 @@
         <w:rPr>
           <w:rFonts w:ascii="Arial" w:hAnsi="Arial"/>
           <w:b/>
+          <w:sz w:val="24"/>
+          <w:szCs w:val="24"/>
           <w:lang w:val="es-SV"/>
         </w:rPr>
         <w:t>texto</w:t>
@@ -599,6 +786,8 @@
         <w:rPr>
           <w:rFonts w:ascii="Arial" w:hAnsi="Arial"/>
           <w:b/>
+          <w:sz w:val="24"/>
+          <w:szCs w:val="24"/>
           <w:lang w:val="es-SV"/>
         </w:rPr>
         <w:t>_delitos_</w:t>
@@ -608,6 +797,8 @@
         <w:rPr>
           <w:rFonts w:ascii="Arial" w:hAnsi="Arial"/>
           <w:b/>
+          <w:sz w:val="24"/>
+          <w:szCs w:val="24"/>
           <w:lang w:val="es-SV"/>
         </w:rPr>
         <w:t>remision</w:t>
@@ -617,6 +808,8 @@
         <w:rPr>
           <w:rFonts w:ascii="Arial" w:hAnsi="Arial"/>
           <w:b/>
+          <w:sz w:val="24"/>
+          <w:szCs w:val="24"/>
           <w:lang w:val="es-SV"/>
         </w:rPr>
         <w:t xml:space="preserve"> }</w:t>
@@ -626,6 +819,8 @@
         <w:rPr>
           <w:rFonts w:ascii="Arial" w:hAnsi="Arial"/>
           <w:b/>
+          <w:sz w:val="24"/>
+          <w:szCs w:val="24"/>
           <w:lang w:val="es-SV"/>
         </w:rPr>
         <w:t xml:space="preserve">}, en perjuicio de </w:t>
@@ -635,6 +830,8 @@
         <w:rPr>
           <w:rFonts w:ascii="Arial" w:hAnsi="Arial"/>
           <w:b/>
+          <w:sz w:val="24"/>
+          <w:szCs w:val="24"/>
           <w:lang w:val="es-SV"/>
         </w:rPr>
         <w:t xml:space="preserve">{{ </w:t>
@@ -644,6 +841,8 @@
         <w:rPr>
           <w:rFonts w:ascii="Arial" w:hAnsi="Arial"/>
           <w:b/>
+          <w:sz w:val="24"/>
+          <w:szCs w:val="24"/>
           <w:lang w:val="es-SV"/>
         </w:rPr>
         <w:t>bloque</w:t>
@@ -653,6 +852,8 @@
         <w:rPr>
           <w:rFonts w:ascii="Arial" w:hAnsi="Arial"/>
           <w:b/>
+          <w:sz w:val="24"/>
+          <w:szCs w:val="24"/>
           <w:lang w:val="es-SV"/>
         </w:rPr>
         <w:t>_victimas_</w:t>
@@ -662,6 +863,8 @@
         <w:rPr>
           <w:rFonts w:ascii="Arial" w:hAnsi="Arial"/>
           <w:b/>
+          <w:sz w:val="24"/>
+          <w:szCs w:val="24"/>
           <w:lang w:val="es-SV"/>
         </w:rPr>
         <w:t>remision</w:t>
@@ -671,6 +874,8 @@
         <w:rPr>
           <w:rFonts w:ascii="Arial" w:hAnsi="Arial"/>
           <w:b/>
+          <w:sz w:val="24"/>
+          <w:szCs w:val="24"/>
           <w:lang w:val="es-SV"/>
         </w:rPr>
         <w:t xml:space="preserve"> }</w:t>
@@ -680,6 +885,8 @@
         <w:rPr>
           <w:rFonts w:ascii="Arial" w:hAnsi="Arial"/>
           <w:b/>
+          <w:sz w:val="24"/>
+          <w:szCs w:val="24"/>
           <w:lang w:val="es-SV"/>
         </w:rPr>
         <w:t xml:space="preserve">}. HECHO OCURRIDO de la siguiente forma: </w:t>
@@ -689,6 +896,8 @@
         <w:rPr>
           <w:rFonts w:ascii="Arial" w:hAnsi="Arial"/>
           <w:b/>
+          <w:sz w:val="24"/>
+          <w:szCs w:val="24"/>
           <w:lang w:val="es-SV"/>
         </w:rPr>
         <w:t xml:space="preserve">{{ </w:t>
@@ -698,6 +907,8 @@
         <w:rPr>
           <w:rFonts w:ascii="Arial" w:hAnsi="Arial"/>
           <w:b/>
+          <w:sz w:val="24"/>
+          <w:szCs w:val="24"/>
           <w:lang w:val="es-SV"/>
         </w:rPr>
         <w:t>relato</w:t>
@@ -707,6 +918,8 @@
         <w:rPr>
           <w:rFonts w:ascii="Arial" w:hAnsi="Arial"/>
           <w:b/>
+          <w:sz w:val="24"/>
+          <w:szCs w:val="24"/>
           <w:lang w:val="es-SV"/>
         </w:rPr>
         <w:t>_</w:t>
@@ -716,6 +929,8 @@
         <w:rPr>
           <w:rFonts w:ascii="Arial" w:hAnsi="Arial"/>
           <w:b/>
+          <w:sz w:val="24"/>
+          <w:szCs w:val="24"/>
           <w:lang w:val="es-SV"/>
         </w:rPr>
         <w:t>hecho</w:t>
@@ -725,6 +940,8 @@
         <w:rPr>
           <w:rFonts w:ascii="Arial" w:hAnsi="Arial"/>
           <w:b/>
+          <w:sz w:val="24"/>
+          <w:szCs w:val="24"/>
           <w:lang w:val="es-SV"/>
         </w:rPr>
         <w:t xml:space="preserve"> }</w:t>
@@ -734,6 +951,8 @@
         <w:rPr>
           <w:rFonts w:ascii="Arial" w:hAnsi="Arial"/>
           <w:b/>
+          <w:sz w:val="24"/>
+          <w:szCs w:val="24"/>
           <w:lang w:val="es-SV"/>
         </w:rPr>
         <w:t xml:space="preserve">}. Por lo que se </w:t>
@@ -743,6 +962,8 @@
         <w:rPr>
           <w:rFonts w:ascii="Arial" w:hAnsi="Arial"/>
           <w:b/>
+          <w:sz w:val="24"/>
+          <w:szCs w:val="24"/>
           <w:lang w:val="es-SV"/>
         </w:rPr>
         <w:t xml:space="preserve">{{ </w:t>
@@ -752,6 +973,8 @@
         <w:rPr>
           <w:rFonts w:ascii="Arial" w:hAnsi="Arial"/>
           <w:b/>
+          <w:sz w:val="24"/>
+          <w:szCs w:val="24"/>
           <w:lang w:val="es-SV"/>
         </w:rPr>
         <w:t>plural</w:t>
@@ -761,6 +984,8 @@
         <w:rPr>
           <w:rFonts w:ascii="Arial" w:hAnsi="Arial"/>
           <w:b/>
+          <w:sz w:val="24"/>
+          <w:szCs w:val="24"/>
           <w:lang w:val="es-SV"/>
         </w:rPr>
         <w:t>_</w:t>
@@ -770,6 +995,8 @@
         <w:rPr>
           <w:rFonts w:ascii="Arial" w:hAnsi="Arial"/>
           <w:b/>
+          <w:sz w:val="24"/>
+          <w:szCs w:val="24"/>
           <w:lang w:val="es-SV"/>
         </w:rPr>
         <w:t>les</w:t>
@@ -779,6 +1006,8 @@
         <w:rPr>
           <w:rFonts w:ascii="Arial" w:hAnsi="Arial"/>
           <w:b/>
+          <w:sz w:val="24"/>
+          <w:szCs w:val="24"/>
           <w:lang w:val="es-SV"/>
         </w:rPr>
         <w:t xml:space="preserve"> }</w:t>
@@ -788,6 +1017,8 @@
         <w:rPr>
           <w:rFonts w:ascii="Arial" w:hAnsi="Arial"/>
           <w:b/>
+          <w:sz w:val="24"/>
+          <w:szCs w:val="24"/>
           <w:lang w:val="es-SV"/>
         </w:rPr>
         <w:t xml:space="preserve">} manifestó a </w:t>
@@ -797,6 +1028,8 @@
         <w:rPr>
           <w:rFonts w:ascii="Arial" w:hAnsi="Arial"/>
           <w:b/>
+          <w:sz w:val="24"/>
+          <w:szCs w:val="24"/>
           <w:lang w:val="es-SV"/>
         </w:rPr>
         <w:t xml:space="preserve">{{ </w:t>
@@ -806,6 +1039,8 @@
         <w:rPr>
           <w:rFonts w:ascii="Arial" w:hAnsi="Arial"/>
           <w:b/>
+          <w:sz w:val="24"/>
+          <w:szCs w:val="24"/>
           <w:lang w:val="es-SV"/>
         </w:rPr>
         <w:t>nombres</w:t>
@@ -815,6 +1050,8 @@
         <w:rPr>
           <w:rFonts w:ascii="Arial" w:hAnsi="Arial"/>
           <w:b/>
+          <w:sz w:val="24"/>
+          <w:szCs w:val="24"/>
           <w:lang w:val="es-SV"/>
         </w:rPr>
         <w:t>_</w:t>
@@ -824,6 +1061,8 @@
         <w:rPr>
           <w:rFonts w:ascii="Arial" w:hAnsi="Arial"/>
           <w:b/>
+          <w:sz w:val="24"/>
+          <w:szCs w:val="24"/>
           <w:lang w:val="es-SV"/>
         </w:rPr>
         <w:t>imputados</w:t>
@@ -833,6 +1072,8 @@
         <w:rPr>
           <w:rFonts w:ascii="Arial" w:hAnsi="Arial"/>
           <w:b/>
+          <w:sz w:val="24"/>
+          <w:szCs w:val="24"/>
           <w:lang w:val="es-SV"/>
         </w:rPr>
         <w:t xml:space="preserve"> }</w:t>
@@ -842,6 +1083,8 @@
         <w:rPr>
           <w:rFonts w:ascii="Arial" w:hAnsi="Arial"/>
           <w:b/>
+          <w:sz w:val="24"/>
+          <w:szCs w:val="24"/>
           <w:lang w:val="es-SV"/>
         </w:rPr>
         <w:t xml:space="preserve">} que </w:t>
@@ -851,6 +1094,8 @@
         <w:rPr>
           <w:rFonts w:ascii="Arial" w:hAnsi="Arial"/>
           <w:b/>
+          <w:sz w:val="24"/>
+          <w:szCs w:val="24"/>
           <w:lang w:val="es-SV"/>
         </w:rPr>
         <w:t xml:space="preserve">{{ </w:t>
@@ -860,6 +1105,8 @@
         <w:rPr>
           <w:rFonts w:ascii="Arial" w:hAnsi="Arial"/>
           <w:b/>
+          <w:sz w:val="24"/>
+          <w:szCs w:val="24"/>
           <w:lang w:val="es-SV"/>
         </w:rPr>
         <w:t>plural</w:t>
@@ -869,6 +1116,8 @@
         <w:rPr>
           <w:rFonts w:ascii="Arial" w:hAnsi="Arial"/>
           <w:b/>
+          <w:sz w:val="24"/>
+          <w:szCs w:val="24"/>
           <w:lang w:val="es-SV"/>
         </w:rPr>
         <w:t>_</w:t>
@@ -878,6 +1127,8 @@
         <w:rPr>
           <w:rFonts w:ascii="Arial" w:hAnsi="Arial"/>
           <w:b/>
+          <w:sz w:val="24"/>
+          <w:szCs w:val="24"/>
           <w:lang w:val="es-SV"/>
         </w:rPr>
         <w:t>quedarian</w:t>
@@ -887,6 +1138,8 @@
         <w:rPr>
           <w:rFonts w:ascii="Arial" w:hAnsi="Arial"/>
           <w:b/>
+          <w:sz w:val="24"/>
+          <w:szCs w:val="24"/>
           <w:lang w:val="es-SV"/>
         </w:rPr>
         <w:t xml:space="preserve"> }</w:t>
@@ -896,6 +1149,8 @@
         <w:rPr>
           <w:rFonts w:ascii="Arial" w:hAnsi="Arial"/>
           <w:b/>
+          <w:sz w:val="24"/>
+          <w:szCs w:val="24"/>
           <w:lang w:val="es-SV"/>
         </w:rPr>
         <w:t xml:space="preserve">} </w:t>
@@ -905,6 +1160,8 @@
         <w:rPr>
           <w:rFonts w:ascii="Arial" w:hAnsi="Arial"/>
           <w:b/>
+          <w:sz w:val="24"/>
+          <w:szCs w:val="24"/>
           <w:lang w:val="es-SV"/>
         </w:rPr>
         <w:t xml:space="preserve">{{ </w:t>
@@ -914,6 +1171,8 @@
         <w:rPr>
           <w:rFonts w:ascii="Arial" w:hAnsi="Arial"/>
           <w:b/>
+          <w:sz w:val="24"/>
+          <w:szCs w:val="24"/>
           <w:lang w:val="es-SV"/>
         </w:rPr>
         <w:t>plural</w:t>
@@ -923,6 +1182,8 @@
         <w:rPr>
           <w:rFonts w:ascii="Arial" w:hAnsi="Arial"/>
           <w:b/>
+          <w:sz w:val="24"/>
+          <w:szCs w:val="24"/>
           <w:lang w:val="es-SV"/>
         </w:rPr>
         <w:t>_</w:t>
@@ -932,6 +1193,8 @@
         <w:rPr>
           <w:rFonts w:ascii="Arial" w:hAnsi="Arial"/>
           <w:b/>
+          <w:sz w:val="24"/>
+          <w:szCs w:val="24"/>
           <w:lang w:val="es-SV"/>
         </w:rPr>
         <w:t>detenidos</w:t>
@@ -941,6 +1204,8 @@
         <w:rPr>
           <w:rFonts w:ascii="Arial" w:hAnsi="Arial"/>
           <w:b/>
+          <w:sz w:val="24"/>
+          <w:szCs w:val="24"/>
           <w:lang w:val="es-SV"/>
         </w:rPr>
         <w:t xml:space="preserve"> }</w:t>
@@ -950,6 +1215,8 @@
         <w:rPr>
           <w:rFonts w:ascii="Arial" w:hAnsi="Arial"/>
           <w:b/>
+          <w:sz w:val="24"/>
+          <w:szCs w:val="24"/>
           <w:lang w:val="es-SV"/>
         </w:rPr>
         <w:t xml:space="preserve">} </w:t>
@@ -959,6 +1226,8 @@
         <w:rPr>
           <w:rFonts w:ascii="Arial" w:hAnsi="Arial"/>
           <w:b/>
+          <w:sz w:val="24"/>
+          <w:szCs w:val="24"/>
           <w:lang w:val="es-SV"/>
         </w:rPr>
         <w:t xml:space="preserve">{{ </w:t>
@@ -968,6 +1237,8 @@
         <w:rPr>
           <w:rFonts w:ascii="Arial" w:hAnsi="Arial"/>
           <w:b/>
+          <w:sz w:val="24"/>
+          <w:szCs w:val="24"/>
           <w:lang w:val="es-SV"/>
         </w:rPr>
         <w:t>texto</w:t>
@@ -977,6 +1248,8 @@
         <w:rPr>
           <w:rFonts w:ascii="Arial" w:hAnsi="Arial"/>
           <w:b/>
+          <w:sz w:val="24"/>
+          <w:szCs w:val="24"/>
           <w:lang w:val="es-SV"/>
         </w:rPr>
         <w:t>_delitos_</w:t>
@@ -986,6 +1259,8 @@
         <w:rPr>
           <w:rFonts w:ascii="Arial" w:hAnsi="Arial"/>
           <w:b/>
+          <w:sz w:val="24"/>
+          <w:szCs w:val="24"/>
           <w:lang w:val="es-SV"/>
         </w:rPr>
         <w:t>resumen</w:t>
@@ -995,6 +1270,8 @@
         <w:rPr>
           <w:rFonts w:ascii="Arial" w:hAnsi="Arial"/>
           <w:b/>
+          <w:sz w:val="24"/>
+          <w:szCs w:val="24"/>
           <w:lang w:val="es-SV"/>
         </w:rPr>
         <w:t xml:space="preserve"> }</w:t>
@@ -1004,6 +1281,8 @@
         <w:rPr>
           <w:rFonts w:ascii="Arial" w:hAnsi="Arial"/>
           <w:b/>
+          <w:sz w:val="24"/>
+          <w:szCs w:val="24"/>
           <w:lang w:val="es-SV"/>
         </w:rPr>
         <w:t xml:space="preserve">}. Al momento de la detención se {{ </w:t>
@@ -1013,6 +1292,8 @@
         <w:rPr>
           <w:rFonts w:ascii="Arial" w:hAnsi="Arial"/>
           <w:b/>
+          <w:sz w:val="24"/>
+          <w:szCs w:val="24"/>
           <w:lang w:val="es-SV"/>
         </w:rPr>
         <w:t>plural_les</w:t>
@@ -1022,6 +1303,8 @@
         <w:rPr>
           <w:rFonts w:ascii="Arial" w:hAnsi="Arial"/>
           <w:b/>
+          <w:sz w:val="24"/>
+          <w:szCs w:val="24"/>
           <w:lang w:val="es-SV"/>
         </w:rPr>
         <w:t xml:space="preserve"> }} hicieron saber sus Derechos de manera inmediata y comprensible de conformidad a lo prescrito en el Artículo doce de la Constitución de la República y el Artículo ochenta y dos del código procesal penal; al preguntarle{{ </w:t>
@@ -1031,6 +1314,8 @@
         <w:rPr>
           <w:rFonts w:ascii="Arial" w:hAnsi="Arial"/>
           <w:b/>
+          <w:sz w:val="24"/>
+          <w:szCs w:val="24"/>
           <w:lang w:val="es-SV"/>
         </w:rPr>
         <w:t>plural_s</w:t>
@@ -1040,6 +1325,8 @@
         <w:rPr>
           <w:rFonts w:ascii="Arial" w:hAnsi="Arial"/>
           <w:b/>
+          <w:sz w:val="24"/>
+          <w:szCs w:val="24"/>
           <w:lang w:val="es-SV"/>
         </w:rPr>
         <w:t xml:space="preserve"> }} si {{ </w:t>
@@ -1049,6 +1336,8 @@
         <w:rPr>
           <w:rFonts w:ascii="Arial" w:hAnsi="Arial"/>
           <w:b/>
+          <w:sz w:val="24"/>
+          <w:szCs w:val="24"/>
           <w:lang w:val="es-SV"/>
         </w:rPr>
         <w:t>plural_nombrarian</w:t>
@@ -1058,6 +1347,8 @@
         <w:rPr>
           <w:rFonts w:ascii="Arial" w:hAnsi="Arial"/>
           <w:b/>
+          <w:sz w:val="24"/>
+          <w:szCs w:val="24"/>
           <w:lang w:val="es-SV"/>
         </w:rPr>
         <w:t xml:space="preserve"> }} a un abogado para que {{ </w:t>
@@ -1067,6 +1358,8 @@
         <w:rPr>
           <w:rFonts w:ascii="Arial" w:hAnsi="Arial"/>
           <w:b/>
+          <w:sz w:val="24"/>
+          <w:szCs w:val="24"/>
           <w:lang w:val="es-SV"/>
         </w:rPr>
         <w:t>plural_les</w:t>
@@ -1076,6 +1369,8 @@
         <w:rPr>
           <w:rFonts w:ascii="Arial" w:hAnsi="Arial"/>
           <w:b/>
+          <w:sz w:val="24"/>
+          <w:szCs w:val="24"/>
           <w:lang w:val="es-SV"/>
         </w:rPr>
         <w:t xml:space="preserve"> }} asista en las presentes diligencias {{ </w:t>
@@ -1085,6 +1380,8 @@
         <w:rPr>
           <w:rFonts w:ascii="Arial" w:hAnsi="Arial"/>
           <w:b/>
+          <w:sz w:val="24"/>
+          <w:szCs w:val="24"/>
           <w:lang w:val="es-SV"/>
         </w:rPr>
         <w:t>plural_este</w:t>
@@ -1094,6 +1391,8 @@
         <w:rPr>
           <w:rFonts w:ascii="Arial" w:hAnsi="Arial"/>
           <w:b/>
+          <w:sz w:val="24"/>
+          <w:szCs w:val="24"/>
           <w:lang w:val="es-SV"/>
         </w:rPr>
         <w:t xml:space="preserve"> }} {{ </w:t>
@@ -1103,6 +1402,8 @@
         <w:rPr>
           <w:rFonts w:ascii="Arial" w:hAnsi="Arial"/>
           <w:b/>
+          <w:sz w:val="24"/>
+          <w:szCs w:val="24"/>
           <w:lang w:val="es-SV"/>
         </w:rPr>
         <w:t>plural_manifesto</w:t>
@@ -1112,6 +1413,8 @@
         <w:rPr>
           <w:rFonts w:ascii="Arial" w:hAnsi="Arial"/>
           <w:b/>
+          <w:sz w:val="24"/>
+          <w:szCs w:val="24"/>
           <w:lang w:val="es-SV"/>
         </w:rPr>
         <w:t xml:space="preserve"> }} que NO, por carecer de recursos económicos, por lo que se {{ </w:t>
@@ -1121,6 +1424,8 @@
         <w:rPr>
           <w:rFonts w:ascii="Arial" w:hAnsi="Arial"/>
           <w:b/>
+          <w:sz w:val="24"/>
+          <w:szCs w:val="24"/>
           <w:lang w:val="es-SV"/>
         </w:rPr>
         <w:t>plural_les</w:t>
@@ -1130,6 +1435,8 @@
         <w:rPr>
           <w:rFonts w:ascii="Arial" w:hAnsi="Arial"/>
           <w:b/>
+          <w:sz w:val="24"/>
+          <w:szCs w:val="24"/>
           <w:lang w:val="es-SV"/>
         </w:rPr>
         <w:t xml:space="preserve"> }} manifestó que se {{ </w:t>
@@ -1139,6 +1446,8 @@
         <w:rPr>
           <w:rFonts w:ascii="Arial" w:hAnsi="Arial"/>
           <w:b/>
+          <w:sz w:val="24"/>
+          <w:szCs w:val="24"/>
           <w:lang w:val="es-SV"/>
         </w:rPr>
         <w:t>plural_les</w:t>
@@ -1148,6 +1457,8 @@
         <w:rPr>
           <w:rFonts w:ascii="Arial" w:hAnsi="Arial"/>
           <w:b/>
+          <w:sz w:val="24"/>
+          <w:szCs w:val="24"/>
           <w:lang w:val="es-SV"/>
         </w:rPr>
         <w:t xml:space="preserve"> }} solicitará un defensor a la Procuraduría General de la República para que {{ </w:t>
@@ -1157,6 +1468,8 @@
         <w:rPr>
           <w:rFonts w:ascii="Arial" w:hAnsi="Arial"/>
           <w:b/>
+          <w:sz w:val="24"/>
+          <w:szCs w:val="24"/>
           <w:lang w:val="es-SV"/>
         </w:rPr>
         <w:t>el_los_represente</w:t>
@@ -1166,6 +1479,8 @@
         <w:rPr>
           <w:rFonts w:ascii="Arial" w:hAnsi="Arial"/>
           <w:b/>
+          <w:sz w:val="24"/>
+          <w:szCs w:val="24"/>
           <w:lang w:val="es-SV"/>
         </w:rPr>
         <w:t xml:space="preserve"> }} durante el proceso. Asimismo:</w:t>
@@ -1174,6 +1489,8 @@
         <w:rPr>
           <w:rFonts w:ascii="Arial" w:hAnsi="Arial"/>
           <w:b/>
+          <w:sz w:val="24"/>
+          <w:szCs w:val="24"/>
           <w:lang w:val="es-SV"/>
         </w:rPr>
         <w:t xml:space="preserve"> </w:t>
@@ -1183,6 +1500,8 @@
         <w:rPr>
           <w:rFonts w:ascii="Arial" w:hAnsi="Arial"/>
           <w:b/>
+          <w:sz w:val="24"/>
+          <w:szCs w:val="24"/>
           <w:lang w:val="es-SV"/>
         </w:rPr>
         <w:t xml:space="preserve">{{ </w:t>
@@ -1192,6 +1511,8 @@
         <w:rPr>
           <w:rFonts w:ascii="Arial" w:hAnsi="Arial"/>
           <w:b/>
+          <w:sz w:val="24"/>
+          <w:szCs w:val="24"/>
           <w:lang w:val="es-SV"/>
         </w:rPr>
         <w:t>bloque</w:t>
@@ -1201,6 +1522,8 @@
         <w:rPr>
           <w:rFonts w:ascii="Arial" w:hAnsi="Arial"/>
           <w:b/>
+          <w:sz w:val="24"/>
+          <w:szCs w:val="24"/>
           <w:lang w:val="es-SV"/>
         </w:rPr>
         <w:t>_avisos_</w:t>
@@ -1210,6 +1533,8 @@
         <w:rPr>
           <w:rFonts w:ascii="Arial" w:hAnsi="Arial"/>
           <w:b/>
+          <w:sz w:val="24"/>
+          <w:szCs w:val="24"/>
           <w:lang w:val="es-SV"/>
         </w:rPr>
         <w:t>remision</w:t>
@@ -1219,6 +1544,8 @@
         <w:rPr>
           <w:rFonts w:ascii="Arial" w:hAnsi="Arial"/>
           <w:b/>
+          <w:sz w:val="24"/>
+          <w:szCs w:val="24"/>
           <w:lang w:val="es-SV"/>
         </w:rPr>
         <w:t xml:space="preserve"> }</w:t>
@@ -1228,6 +1555,8 @@
         <w:rPr>
           <w:rFonts w:ascii="Arial" w:hAnsi="Arial"/>
           <w:b/>
+          <w:sz w:val="24"/>
+          <w:szCs w:val="24"/>
           <w:lang w:val="es-SV"/>
         </w:rPr>
         <w:t xml:space="preserve">} No quedando nada en incautación ni depósito. Por lo que se remite quedando en las </w:t>
@@ -1237,6 +1566,8 @@
         <w:rPr>
           <w:rFonts w:ascii="Arial" w:hAnsi="Arial"/>
           <w:b/>
+          <w:sz w:val="24"/>
+          <w:szCs w:val="24"/>
           <w:lang w:val="es-SV"/>
         </w:rPr>
         <w:t xml:space="preserve">{{ </w:t>
@@ -1246,6 +1577,8 @@
         <w:rPr>
           <w:rFonts w:ascii="Arial" w:hAnsi="Arial"/>
           <w:b/>
+          <w:sz w:val="24"/>
+          <w:szCs w:val="24"/>
           <w:lang w:val="es-SV"/>
         </w:rPr>
         <w:t>lugar</w:t>
@@ -1255,6 +1588,8 @@
         <w:rPr>
           <w:rFonts w:ascii="Arial" w:hAnsi="Arial"/>
           <w:b/>
+          <w:sz w:val="24"/>
+          <w:szCs w:val="24"/>
           <w:lang w:val="es-SV"/>
         </w:rPr>
         <w:t>_</w:t>
@@ -1264,6 +1599,8 @@
         <w:rPr>
           <w:rFonts w:ascii="Arial" w:hAnsi="Arial"/>
           <w:b/>
+          <w:sz w:val="24"/>
+          <w:szCs w:val="24"/>
           <w:lang w:val="es-SV"/>
         </w:rPr>
         <w:t>resguardo</w:t>
@@ -1273,6 +1610,8 @@
         <w:rPr>
           <w:rFonts w:ascii="Arial" w:hAnsi="Arial"/>
           <w:b/>
+          <w:sz w:val="24"/>
+          <w:szCs w:val="24"/>
           <w:lang w:val="es-SV"/>
         </w:rPr>
         <w:t xml:space="preserve"> }</w:t>
@@ -1282,6 +1621,8 @@
         <w:rPr>
           <w:rFonts w:ascii="Arial" w:hAnsi="Arial"/>
           <w:b/>
+          <w:sz w:val="24"/>
+          <w:szCs w:val="24"/>
           <w:lang w:val="es-SV"/>
         </w:rPr>
         <w:t xml:space="preserve">}. Y no habiendo nada más que hacer constar en la presente acta, se da por terminada la cual para constancia firmamos, no así </w:t>
@@ -1291,6 +1632,8 @@
         <w:rPr>
           <w:rFonts w:ascii="Arial" w:hAnsi="Arial"/>
           <w:b/>
+          <w:sz w:val="24"/>
+          <w:szCs w:val="24"/>
           <w:lang w:val="es-SV"/>
         </w:rPr>
         <w:t xml:space="preserve">{{ </w:t>
@@ -1300,6 +1643,8 @@
         <w:rPr>
           <w:rFonts w:ascii="Arial" w:hAnsi="Arial"/>
           <w:b/>
+          <w:sz w:val="24"/>
+          <w:szCs w:val="24"/>
           <w:lang w:val="es-SV"/>
         </w:rPr>
         <w:t>el</w:t>
@@ -1309,6 +1654,8 @@
         <w:rPr>
           <w:rFonts w:ascii="Arial" w:hAnsi="Arial"/>
           <w:b/>
+          <w:sz w:val="24"/>
+          <w:szCs w:val="24"/>
           <w:lang w:val="es-SV"/>
         </w:rPr>
         <w:t>_los_</w:t>
@@ -1318,6 +1665,8 @@
         <w:rPr>
           <w:rFonts w:ascii="Arial" w:hAnsi="Arial"/>
           <w:b/>
+          <w:sz w:val="24"/>
+          <w:szCs w:val="24"/>
           <w:lang w:val="es-SV"/>
         </w:rPr>
         <w:t>detenidos</w:t>
@@ -1327,6 +1676,8 @@
         <w:rPr>
           <w:rFonts w:ascii="Arial" w:hAnsi="Arial"/>
           <w:b/>
+          <w:sz w:val="24"/>
+          <w:szCs w:val="24"/>
           <w:lang w:val="es-SV"/>
         </w:rPr>
         <w:t xml:space="preserve"> }</w:t>
@@ -1336,6 +1687,8 @@
         <w:rPr>
           <w:rFonts w:ascii="Arial" w:hAnsi="Arial"/>
           <w:b/>
+          <w:sz w:val="24"/>
+          <w:szCs w:val="24"/>
           <w:lang w:val="es-SV"/>
         </w:rPr>
         <w:t>} por negarse a hacerlo.</w:t>
@@ -1347,6 +1700,8 @@
         <w:rPr>
           <w:rFonts w:ascii="Arial" w:hAnsi="Arial"/>
           <w:b/>
+          <w:sz w:val="24"/>
+          <w:szCs w:val="24"/>
           <w:lang w:val="es-SV"/>
         </w:rPr>
       </w:pPr>
@@ -1357,6 +1712,8 @@
         <w:rPr>
           <w:rFonts w:ascii="Arial" w:hAnsi="Arial"/>
           <w:b/>
+          <w:sz w:val="24"/>
+          <w:szCs w:val="24"/>
           <w:lang w:val="es-SV"/>
         </w:rPr>
       </w:pPr>
@@ -1367,6 +1724,8 @@
         <w:rPr>
           <w:rFonts w:ascii="Arial" w:hAnsi="Arial"/>
           <w:b/>
+          <w:sz w:val="24"/>
+          <w:szCs w:val="24"/>
           <w:lang w:val="es-SV"/>
         </w:rPr>
       </w:pPr>
@@ -1374,6 +1733,8 @@
         <w:rPr>
           <w:rFonts w:ascii="Arial" w:hAnsi="Arial"/>
           <w:b/>
+          <w:sz w:val="24"/>
+          <w:szCs w:val="24"/>
           <w:lang w:val="es-SV"/>
         </w:rPr>
         <w:t xml:space="preserve">CAPTOR                                      </w:t>
@@ -1383,6 +1744,8 @@
         <w:rPr>
           <w:rFonts w:ascii="Arial" w:hAnsi="Arial"/>
           <w:b/>
+          <w:sz w:val="24"/>
+          <w:szCs w:val="24"/>
           <w:lang w:val="es-SV"/>
         </w:rPr>
         <w:t>CAPTOR</w:t>
@@ -1395,6 +1758,8 @@
         <w:rPr>
           <w:rFonts w:ascii="Arial" w:hAnsi="Arial"/>
           <w:b/>
+          <w:sz w:val="24"/>
+          <w:szCs w:val="24"/>
           <w:lang w:val="es-SV"/>
         </w:rPr>
       </w:pPr>
@@ -1405,6 +1770,8 @@
         <w:rPr>
           <w:rFonts w:ascii="Arial" w:hAnsi="Arial"/>
           <w:b/>
+          <w:sz w:val="24"/>
+          <w:szCs w:val="24"/>
           <w:lang w:val="es-SV"/>
         </w:rPr>
       </w:pPr>
@@ -1415,6 +1782,8 @@
         <w:rPr>
           <w:rFonts w:ascii="Arial" w:hAnsi="Arial"/>
           <w:b/>
+          <w:sz w:val="24"/>
+          <w:szCs w:val="24"/>
           <w:lang w:val="es-SV"/>
         </w:rPr>
       </w:pPr>
@@ -1422,6 +1791,8 @@
         <w:rPr>
           <w:rFonts w:ascii="Arial" w:hAnsi="Arial"/>
           <w:b/>
+          <w:sz w:val="24"/>
+          <w:szCs w:val="24"/>
           <w:lang w:val="es-SV"/>
         </w:rPr>
         <w:t xml:space="preserve">{% </w:t>
@@ -1431,6 +1802,8 @@
         <w:rPr>
           <w:rFonts w:ascii="Arial" w:hAnsi="Arial"/>
           <w:b/>
+          <w:sz w:val="24"/>
+          <w:szCs w:val="24"/>
           <w:lang w:val="es-SV"/>
         </w:rPr>
         <w:t>for</w:t>
@@ -1440,6 +1813,8 @@
         <w:rPr>
           <w:rFonts w:ascii="Arial" w:hAnsi="Arial"/>
           <w:b/>
+          <w:sz w:val="24"/>
+          <w:szCs w:val="24"/>
           <w:lang w:val="es-SV"/>
         </w:rPr>
         <w:t xml:space="preserve"> imp in </w:t>
@@ -1449,6 +1824,8 @@
         <w:rPr>
           <w:rFonts w:ascii="Arial" w:hAnsi="Arial"/>
           <w:b/>
+          <w:sz w:val="24"/>
+          <w:szCs w:val="24"/>
           <w:lang w:val="es-SV"/>
         </w:rPr>
         <w:t>lista_imputados</w:t>
@@ -1458,6 +1835,8 @@
         <w:rPr>
           <w:rFonts w:ascii="Arial" w:hAnsi="Arial"/>
           <w:b/>
+          <w:sz w:val="24"/>
+          <w:szCs w:val="24"/>
           <w:lang w:val="es-SV"/>
         </w:rPr>
         <w:t xml:space="preserve"> %}</w:t>
@@ -1469,6 +1848,8 @@
         <w:rPr>
           <w:rFonts w:ascii="Arial" w:hAnsi="Arial"/>
           <w:b/>
+          <w:sz w:val="24"/>
+          <w:szCs w:val="24"/>
           <w:lang w:val="es-SV"/>
         </w:rPr>
       </w:pPr>
@@ -1479,6 +1860,8 @@
         <w:rPr>
           <w:rFonts w:ascii="Arial" w:hAnsi="Arial"/>
           <w:b/>
+          <w:sz w:val="24"/>
+          <w:szCs w:val="24"/>
           <w:lang w:val="es-SV"/>
         </w:rPr>
       </w:pPr>
@@ -1486,6 +1869,8 @@
         <w:rPr>
           <w:rFonts w:ascii="Arial" w:hAnsi="Arial"/>
           <w:b/>
+          <w:sz w:val="24"/>
+          <w:szCs w:val="24"/>
           <w:lang w:val="es-SV"/>
         </w:rPr>
         <w:t>F______________________</w:t>
@@ -1497,6 +1882,8 @@
         <w:rPr>
           <w:rFonts w:ascii="Arial" w:hAnsi="Arial"/>
           <w:b/>
+          <w:sz w:val="24"/>
+          <w:szCs w:val="24"/>
           <w:lang w:val="es-SV"/>
         </w:rPr>
       </w:pPr>
@@ -1505,6 +1892,8 @@
         <w:rPr>
           <w:rFonts w:ascii="Arial" w:hAnsi="Arial"/>
           <w:b/>
+          <w:sz w:val="24"/>
+          <w:szCs w:val="24"/>
           <w:lang w:val="es-SV"/>
         </w:rPr>
         <w:t xml:space="preserve">{{ </w:t>
@@ -1514,6 +1903,8 @@
         <w:rPr>
           <w:rFonts w:ascii="Arial" w:hAnsi="Arial"/>
           <w:b/>
+          <w:sz w:val="24"/>
+          <w:szCs w:val="24"/>
           <w:lang w:val="es-SV"/>
         </w:rPr>
         <w:t>imp</w:t>
@@ -1523,6 +1914,8 @@
         <w:rPr>
           <w:rFonts w:ascii="Arial" w:hAnsi="Arial"/>
           <w:b/>
+          <w:sz w:val="24"/>
+          <w:szCs w:val="24"/>
           <w:lang w:val="es-SV"/>
         </w:rPr>
         <w:t>.</w:t>
@@ -1532,6 +1925,8 @@
         <w:rPr>
           <w:rFonts w:ascii="Arial" w:hAnsi="Arial"/>
           <w:b/>
+          <w:sz w:val="24"/>
+          <w:szCs w:val="24"/>
           <w:lang w:val="es-SV"/>
         </w:rPr>
         <w:t>Nombre</w:t>
@@ -1541,6 +1936,8 @@
         <w:rPr>
           <w:rFonts w:ascii="Arial" w:hAnsi="Arial"/>
           <w:b/>
+          <w:sz w:val="24"/>
+          <w:szCs w:val="24"/>
           <w:lang w:val="es-SV"/>
         </w:rPr>
         <w:t xml:space="preserve"> }</w:t>
@@ -1550,6 +1947,8 @@
         <w:rPr>
           <w:rFonts w:ascii="Arial" w:hAnsi="Arial"/>
           <w:b/>
+          <w:sz w:val="24"/>
+          <w:szCs w:val="24"/>
           <w:lang w:val="es-SV"/>
         </w:rPr>
         <w:t>} (</w:t>
@@ -1559,6 +1958,8 @@
         <w:rPr>
           <w:rFonts w:ascii="Arial" w:hAnsi="Arial"/>
           <w:b/>
+          <w:sz w:val="24"/>
+          <w:szCs w:val="24"/>
           <w:lang w:val="es-SV"/>
         </w:rPr>
         <w:t xml:space="preserve">DETENID{{ </w:t>
@@ -1568,6 +1969,8 @@
         <w:rPr>
           <w:rFonts w:ascii="Arial" w:hAnsi="Arial"/>
           <w:b/>
+          <w:sz w:val="24"/>
+          <w:szCs w:val="24"/>
           <w:lang w:val="es-SV"/>
         </w:rPr>
         <w:t>imp</w:t>
@@ -1577,6 +1980,8 @@
         <w:rPr>
           <w:rFonts w:ascii="Arial" w:hAnsi="Arial"/>
           <w:b/>
+          <w:sz w:val="24"/>
+          <w:szCs w:val="24"/>
           <w:lang w:val="es-SV"/>
         </w:rPr>
         <w:t>.letra_o_</w:t>
@@ -1586,6 +1991,8 @@
         <w:rPr>
           <w:rFonts w:ascii="Arial" w:hAnsi="Arial"/>
           <w:b/>
+          <w:sz w:val="24"/>
+          <w:szCs w:val="24"/>
           <w:lang w:val="es-SV"/>
         </w:rPr>
         <w:t>a</w:t>
@@ -1595,6 +2002,8 @@
         <w:rPr>
           <w:rFonts w:ascii="Arial" w:hAnsi="Arial"/>
           <w:b/>
+          <w:sz w:val="24"/>
+          <w:szCs w:val="24"/>
           <w:lang w:val="es-SV"/>
         </w:rPr>
         <w:t xml:space="preserve"> }</w:t>
@@ -1604,6 +2013,8 @@
         <w:rPr>
           <w:rFonts w:ascii="Arial" w:hAnsi="Arial"/>
           <w:b/>
+          <w:sz w:val="24"/>
+          <w:szCs w:val="24"/>
           <w:lang w:val="es-SV"/>
         </w:rPr>
         <w:t>})</w:t>
@@ -1612,11 +2023,17 @@
     <w:p>
       <w:pPr>
         <w:jc w:val="center"/>
+        <w:rPr>
+          <w:sz w:val="24"/>
+          <w:szCs w:val="24"/>
+        </w:rPr>
       </w:pPr>
       <w:r>
         <w:rPr>
           <w:rFonts w:ascii="Arial" w:hAnsi="Arial"/>
           <w:b/>
+          <w:sz w:val="24"/>
+          <w:szCs w:val="24"/>
           <w:lang w:val="es-SV"/>
         </w:rPr>
         <w:t xml:space="preserve">{% </w:t>
@@ -1626,6 +2043,8 @@
         <w:rPr>
           <w:rFonts w:ascii="Arial" w:hAnsi="Arial"/>
           <w:b/>
+          <w:sz w:val="24"/>
+          <w:szCs w:val="24"/>
           <w:lang w:val="es-SV"/>
         </w:rPr>
         <w:t>endfor</w:t>
@@ -1635,6 +2054,8 @@
         <w:rPr>
           <w:rFonts w:ascii="Arial" w:hAnsi="Arial"/>
           <w:b/>
+          <w:sz w:val="24"/>
+          <w:szCs w:val="24"/>
           <w:lang w:val="es-SV"/>
         </w:rPr>
         <w:t xml:space="preserve"> %}</w:t>
@@ -1642,7 +2063,7 @@
     </w:p>
     <w:sectPr>
       <w:pgSz w:w="12240" w:h="15840"/>
-      <w:pgMar w:top="1440" w:right="1440" w:bottom="1440" w:left="1440" w:header="720" w:footer="720" w:gutter="0"/>
+      <w:pgMar w:top="709" w:right="1440" w:bottom="1440" w:left="1440" w:header="720" w:footer="720" w:gutter="0"/>
       <w:cols w:space="720"/>
       <w:docGrid w:linePitch="360"/>
     </w:sectPr>
@@ -2456,7 +2877,6 @@
   <w:style w:type="character" w:default="1" w:styleId="Fuentedeprrafopredeter">
     <w:name w:val="Default Paragraph Font"/>
     <w:uiPriority w:val="1"/>
-    <w:semiHidden/>
     <w:unhideWhenUsed/>
   </w:style>
   <w:style w:type="table" w:default="1" w:styleId="Tablanormal">

</xml_diff>

<commit_message>
feat: cambio de oficios y parametros de las actas
</commit_message>
<xml_diff>
--- a/01_ACTA_DE_REMISION_PLANTILLA.docx
+++ b/01_ACTA_DE_REMISION_PLANTILLA.docx
@@ -13,6 +13,16 @@
           <w:lang w:val="es-SV"/>
         </w:rPr>
       </w:pPr>
+      <w:r>
+        <w:rPr>
+          <w:rFonts w:ascii="Arial" w:hAnsi="Arial"/>
+          <w:b/>
+          <w:sz w:val="24"/>
+          <w:szCs w:val="24"/>
+          <w:lang w:val="es-SV"/>
+        </w:rPr>
+        <w:t>PNC.SO.112.3.4/n1</w:t>
+      </w:r>
       <w:proofErr w:type="gramStart"/>
       <w:r>
         <w:rPr>
@@ -22,7 +32,7 @@
           <w:szCs w:val="24"/>
           <w:lang w:val="es-SV"/>
         </w:rPr>
-        <w:t xml:space="preserve">{{ </w:t>
+        <w:t xml:space="preserve">-{{ </w:t>
       </w:r>
       <w:proofErr w:type="spellStart"/>
       <w:r>

</xml_diff>